<commit_message>
Tidy up of folders
10/17/2025
</commit_message>
<xml_diff>
--- a/Paper/Method.docx
+++ b/Paper/Method.docx
@@ -19150,50 +19150,52 @@
               </w:rPr>
               <w:t>[</w:t>
             </w:r>
-            <w:r>
-              <w:rPr>
-                <w:b/>
-                <w:bCs/>
-                <w:sz w:val="18"/>
-                <w:szCs w:val="18"/>
-              </w:rPr>
-              <w:t>0, 0.003125, 0.003</w:t>
-            </w:r>
-            <w:r>
-              <w:rPr>
-                <w:b/>
-                <w:bCs/>
-                <w:sz w:val="18"/>
-                <w:szCs w:val="18"/>
-              </w:rPr>
-              <w:t>125</w:t>
-            </w:r>
-            <w:r>
-              <w:rPr>
-                <w:b/>
-                <w:bCs/>
-                <w:sz w:val="18"/>
-                <w:szCs w:val="18"/>
-              </w:rPr>
-              <w:t>, 0.</w:t>
-            </w:r>
-            <w:r>
-              <w:rPr>
-                <w:b/>
-                <w:bCs/>
-                <w:sz w:val="18"/>
-                <w:szCs w:val="18"/>
-              </w:rPr>
-              <w:t>150</w:t>
-            </w:r>
-            <w:r>
-              <w:rPr>
-                <w:b/>
-                <w:bCs/>
-                <w:sz w:val="18"/>
-                <w:szCs w:val="18"/>
-              </w:rPr>
-              <w:t>, 0, 0]</w:t>
+            <w:proofErr w:type="gramStart"/>
+            <w:r>
+              <w:rPr>
+                <w:b/>
+                <w:bCs/>
+                <w:sz w:val="18"/>
+                <w:szCs w:val="18"/>
+              </w:rPr>
+              <w:t>0,</w:t>
+            </w:r>
+            <w:proofErr w:type="gramEnd"/>
+            <w:r>
+              <w:rPr>
+                <w:b/>
+                <w:bCs/>
+                <w:sz w:val="18"/>
+                <w:szCs w:val="18"/>
+              </w:rPr>
+              <w:t xml:space="preserve"> 0, 0, 0, </w:t>
+            </w:r>
+            <w:r>
+              <w:rPr>
+                <w:b/>
+                <w:bCs/>
+                <w:sz w:val="18"/>
+                <w:szCs w:val="18"/>
+              </w:rPr>
+              <w:t>0.0625, 0.</w:t>
+            </w:r>
+            <w:r>
+              <w:rPr>
+                <w:b/>
+                <w:bCs/>
+                <w:sz w:val="18"/>
+                <w:szCs w:val="18"/>
+              </w:rPr>
+              <w:t>0625</w:t>
+            </w:r>
+            <w:r>
+              <w:rPr>
+                <w:b/>
+                <w:bCs/>
+                <w:sz w:val="18"/>
+                <w:szCs w:val="18"/>
+              </w:rPr>
+              <w:t>]</w:t>
             </w:r>
           </w:p>
         </w:tc>
@@ -19398,15 +19400,6 @@
                 <w:szCs w:val="18"/>
               </w:rPr>
             </w:pPr>
-            <w:r>
-              <w:rPr>
-                <w:b/>
-                <w:bCs/>
-                <w:sz w:val="18"/>
-                <w:szCs w:val="18"/>
-              </w:rPr>
-              <w:t>0.066</w:t>
-            </w:r>
           </w:p>
         </w:tc>
         <w:tc>
@@ -19439,15 +19432,6 @@
                 <w:szCs w:val="18"/>
               </w:rPr>
             </w:pPr>
-            <w:r>
-              <w:rPr>
-                <w:b/>
-                <w:bCs/>
-                <w:sz w:val="18"/>
-                <w:szCs w:val="18"/>
-              </w:rPr>
-              <w:t>0.009</w:t>
-            </w:r>
           </w:p>
         </w:tc>
         <w:tc>
@@ -19482,17 +19466,6 @@
                 <w:szCs w:val="20"/>
               </w:rPr>
             </w:pPr>
-            <w:r>
-              <w:rPr>
-                <w:rFonts w:ascii="Aptos Narrow" w:hAnsi="Aptos Narrow"/>
-                <w:b/>
-                <w:bCs/>
-                <w:color w:val="000000"/>
-                <w:sz w:val="20"/>
-                <w:szCs w:val="20"/>
-              </w:rPr>
-              <w:t>0.035</w:t>
-            </w:r>
           </w:p>
         </w:tc>
         <w:tc>
@@ -19525,15 +19498,6 @@
                 <w:szCs w:val="18"/>
               </w:rPr>
             </w:pPr>
-            <w:r>
-              <w:rPr>
-                <w:b/>
-                <w:bCs/>
-                <w:sz w:val="18"/>
-                <w:szCs w:val="18"/>
-              </w:rPr>
-              <w:t>0.242</w:t>
-            </w:r>
           </w:p>
         </w:tc>
         <w:tc>
@@ -19599,15 +19563,6 @@
                 <w:szCs w:val="18"/>
               </w:rPr>
             </w:pPr>
-            <w:r>
-              <w:rPr>
-                <w:b/>
-                <w:bCs/>
-                <w:sz w:val="18"/>
-                <w:szCs w:val="18"/>
-              </w:rPr>
-              <w:t>0.067</w:t>
-            </w:r>
           </w:p>
         </w:tc>
         <w:tc>
@@ -19640,15 +19595,6 @@
                 <w:szCs w:val="18"/>
               </w:rPr>
             </w:pPr>
-            <w:r>
-              <w:rPr>
-                <w:b/>
-                <w:bCs/>
-                <w:sz w:val="18"/>
-                <w:szCs w:val="18"/>
-              </w:rPr>
-              <w:t>0.010</w:t>
-            </w:r>
           </w:p>
         </w:tc>
         <w:tc>
@@ -19681,15 +19627,6 @@
                 <w:szCs w:val="18"/>
               </w:rPr>
             </w:pPr>
-            <w:r>
-              <w:rPr>
-                <w:b/>
-                <w:bCs/>
-                <w:sz w:val="18"/>
-                <w:szCs w:val="18"/>
-              </w:rPr>
-              <w:t>0.038</w:t>
-            </w:r>
           </w:p>
         </w:tc>
         <w:tc>
@@ -19722,15 +19659,6 @@
                 <w:szCs w:val="18"/>
               </w:rPr>
             </w:pPr>
-            <w:r>
-              <w:rPr>
-                <w:b/>
-                <w:bCs/>
-                <w:sz w:val="18"/>
-                <w:szCs w:val="18"/>
-              </w:rPr>
-              <w:t>0.256</w:t>
-            </w:r>
           </w:p>
         </w:tc>
         <w:tc>
@@ -20029,43 +19957,52 @@
                 <w:sz w:val="18"/>
                 <w:szCs w:val="18"/>
               </w:rPr>
-              <w:t>[0, 0.006250, 0.00</w:t>
-            </w:r>
-            <w:r>
-              <w:rPr>
-                <w:b/>
-                <w:bCs/>
-                <w:sz w:val="18"/>
-                <w:szCs w:val="18"/>
-              </w:rPr>
-              <w:t>625</w:t>
-            </w:r>
-            <w:r>
-              <w:rPr>
-                <w:b/>
-                <w:bCs/>
-                <w:sz w:val="18"/>
-                <w:szCs w:val="18"/>
-              </w:rPr>
-              <w:t>0, 0.</w:t>
-            </w:r>
-            <w:r>
-              <w:rPr>
-                <w:b/>
-                <w:bCs/>
-                <w:sz w:val="18"/>
-                <w:szCs w:val="18"/>
-              </w:rPr>
-              <w:t>300</w:t>
-            </w:r>
-            <w:r>
-              <w:rPr>
-                <w:b/>
-                <w:bCs/>
-                <w:sz w:val="18"/>
-                <w:szCs w:val="18"/>
-              </w:rPr>
-              <w:t>, 0, 0]</w:t>
+              <w:t>[</w:t>
+            </w:r>
+            <w:r>
+              <w:rPr>
+                <w:b/>
+                <w:bCs/>
+                <w:sz w:val="18"/>
+                <w:szCs w:val="18"/>
+              </w:rPr>
+              <w:t xml:space="preserve">0, 0, 0, 0, </w:t>
+            </w:r>
+            <w:r>
+              <w:rPr>
+                <w:b/>
+                <w:bCs/>
+                <w:sz w:val="18"/>
+                <w:szCs w:val="18"/>
+              </w:rPr>
+              <w:t>0.1250</w:t>
+            </w:r>
+            <w:r>
+              <w:rPr>
+                <w:b/>
+                <w:bCs/>
+                <w:sz w:val="18"/>
+                <w:szCs w:val="18"/>
+              </w:rPr>
+              <w:t xml:space="preserve">, </w:t>
+            </w:r>
+            <w:r>
+              <w:rPr>
+                <w:b/>
+                <w:bCs/>
+                <w:sz w:val="18"/>
+                <w:szCs w:val="18"/>
+              </w:rPr>
+              <w:t>0.1250</w:t>
+            </w:r>
+            <w:r>
+              <w:rPr>
+                <w:b/>
+                <w:bCs/>
+                <w:sz w:val="18"/>
+                <w:szCs w:val="18"/>
+              </w:rPr>
+              <w:t>]</w:t>
             </w:r>
           </w:p>
         </w:tc>
@@ -20272,17 +20209,6 @@
                 <w:szCs w:val="20"/>
               </w:rPr>
             </w:pPr>
-            <w:r>
-              <w:rPr>
-                <w:rFonts w:ascii="Aptos Narrow" w:hAnsi="Aptos Narrow"/>
-                <w:b/>
-                <w:bCs/>
-                <w:color w:val="000000"/>
-                <w:sz w:val="20"/>
-                <w:szCs w:val="20"/>
-              </w:rPr>
-              <w:t>0.113</w:t>
-            </w:r>
           </w:p>
         </w:tc>
         <w:tc>
@@ -20315,15 +20241,6 @@
                 <w:szCs w:val="18"/>
               </w:rPr>
             </w:pPr>
-            <w:r>
-              <w:rPr>
-                <w:b/>
-                <w:bCs/>
-                <w:sz w:val="18"/>
-                <w:szCs w:val="18"/>
-              </w:rPr>
-              <w:t>0.013</w:t>
-            </w:r>
           </w:p>
         </w:tc>
         <w:tc>
@@ -20356,15 +20273,6 @@
                 <w:szCs w:val="18"/>
               </w:rPr>
             </w:pPr>
-            <w:r>
-              <w:rPr>
-                <w:b/>
-                <w:bCs/>
-                <w:sz w:val="18"/>
-                <w:szCs w:val="18"/>
-              </w:rPr>
-              <w:t>0.043</w:t>
-            </w:r>
           </w:p>
         </w:tc>
         <w:tc>
@@ -20397,15 +20305,6 @@
                 <w:szCs w:val="18"/>
               </w:rPr>
             </w:pPr>
-            <w:r>
-              <w:rPr>
-                <w:b/>
-                <w:bCs/>
-                <w:sz w:val="18"/>
-                <w:szCs w:val="18"/>
-              </w:rPr>
-              <w:t>0.411</w:t>
-            </w:r>
           </w:p>
         </w:tc>
         <w:tc>
@@ -20471,15 +20370,6 @@
                 <w:szCs w:val="18"/>
               </w:rPr>
             </w:pPr>
-            <w:r>
-              <w:rPr>
-                <w:b/>
-                <w:bCs/>
-                <w:sz w:val="18"/>
-                <w:szCs w:val="18"/>
-              </w:rPr>
-              <w:t>0.116</w:t>
-            </w:r>
           </w:p>
         </w:tc>
         <w:tc>
@@ -20512,15 +20402,6 @@
                 <w:szCs w:val="18"/>
               </w:rPr>
             </w:pPr>
-            <w:r>
-              <w:rPr>
-                <w:b/>
-                <w:bCs/>
-                <w:sz w:val="18"/>
-                <w:szCs w:val="18"/>
-              </w:rPr>
-              <w:t>0.014</w:t>
-            </w:r>
           </w:p>
         </w:tc>
         <w:tc>
@@ -20553,15 +20434,6 @@
                 <w:szCs w:val="18"/>
               </w:rPr>
             </w:pPr>
-            <w:r>
-              <w:rPr>
-                <w:b/>
-                <w:bCs/>
-                <w:sz w:val="18"/>
-                <w:szCs w:val="18"/>
-              </w:rPr>
-              <w:t>0.045</w:t>
-            </w:r>
           </w:p>
         </w:tc>
         <w:tc>
@@ -20594,15 +20466,6 @@
                 <w:szCs w:val="18"/>
               </w:rPr>
             </w:pPr>
-            <w:r>
-              <w:rPr>
-                <w:b/>
-                <w:bCs/>
-                <w:sz w:val="18"/>
-                <w:szCs w:val="18"/>
-              </w:rPr>
-              <w:t>0.421</w:t>
-            </w:r>
           </w:p>
         </w:tc>
         <w:tc>
@@ -20910,34 +20773,43 @@
                 <w:sz w:val="18"/>
                 <w:szCs w:val="18"/>
               </w:rPr>
-              <w:t>[0</w:t>
-            </w:r>
-            <w:r>
-              <w:rPr>
-                <w:b/>
-                <w:bCs/>
-                <w:sz w:val="18"/>
-                <w:szCs w:val="18"/>
-              </w:rPr>
-              <w:t>,</w:t>
-            </w:r>
-            <w:r>
-              <w:rPr>
-                <w:b/>
-                <w:bCs/>
-                <w:sz w:val="18"/>
-                <w:szCs w:val="18"/>
-              </w:rPr>
-              <w:t xml:space="preserve"> 0.0</w:t>
-            </w:r>
-            <w:r>
-              <w:rPr>
-                <w:b/>
-                <w:bCs/>
-                <w:sz w:val="18"/>
-                <w:szCs w:val="18"/>
-              </w:rPr>
-              <w:t>1250</w:t>
+              <w:t>[</w:t>
+            </w:r>
+            <w:r>
+              <w:rPr>
+                <w:b/>
+                <w:bCs/>
+                <w:sz w:val="18"/>
+                <w:szCs w:val="18"/>
+              </w:rPr>
+              <w:t xml:space="preserve">0, 0, 0, 0, </w:t>
+            </w:r>
+            <w:r>
+              <w:rPr>
+                <w:b/>
+                <w:bCs/>
+                <w:sz w:val="18"/>
+                <w:szCs w:val="18"/>
+              </w:rPr>
+              <w:t>0.</w:t>
+            </w:r>
+            <w:r>
+              <w:rPr>
+                <w:b/>
+                <w:bCs/>
+                <w:sz w:val="18"/>
+                <w:szCs w:val="18"/>
+              </w:rPr>
+              <w:t>2</w:t>
+            </w:r>
+            <w:r>
+              <w:rPr>
+                <w:b/>
+                <w:bCs/>
+                <w:sz w:val="18"/>
+                <w:szCs w:val="18"/>
+              </w:rPr>
+              <w:t>50</w:t>
             </w:r>
             <w:r>
               <w:rPr>
@@ -20955,52 +20827,25 @@
                 <w:sz w:val="18"/>
                 <w:szCs w:val="18"/>
               </w:rPr>
-              <w:t>0.0</w:t>
-            </w:r>
-            <w:r>
-              <w:rPr>
-                <w:b/>
-                <w:bCs/>
-                <w:sz w:val="18"/>
-                <w:szCs w:val="18"/>
-              </w:rPr>
-              <w:t>1250</w:t>
-            </w:r>
-            <w:r>
-              <w:rPr>
-                <w:b/>
-                <w:bCs/>
-                <w:sz w:val="18"/>
-                <w:szCs w:val="18"/>
-              </w:rPr>
-              <w:t>, 0.</w:t>
-            </w:r>
-            <w:r>
-              <w:rPr>
-                <w:b/>
-                <w:bCs/>
-                <w:sz w:val="18"/>
-                <w:szCs w:val="18"/>
-              </w:rPr>
-              <w:t>600</w:t>
-            </w:r>
-            <w:r>
-              <w:rPr>
-                <w:b/>
-                <w:bCs/>
-                <w:sz w:val="18"/>
-                <w:szCs w:val="18"/>
-              </w:rPr>
-              <w:t>,</w:t>
-            </w:r>
-            <w:r>
-              <w:rPr>
-                <w:b/>
-                <w:bCs/>
-                <w:sz w:val="18"/>
-                <w:szCs w:val="18"/>
-              </w:rPr>
-              <w:t xml:space="preserve"> 0, 0</w:t>
+              <w:t>0.</w:t>
+            </w:r>
+            <w:r>
+              <w:rPr>
+                <w:b/>
+                <w:bCs/>
+                <w:sz w:val="18"/>
+                <w:szCs w:val="18"/>
+              </w:rPr>
+              <w:t>2</w:t>
+            </w:r>
+            <w:r>
+              <w:rPr>
+                <w:b/>
+                <w:bCs/>
+                <w:sz w:val="18"/>
+                <w:szCs w:val="18"/>
+              </w:rPr>
+              <w:t>50</w:t>
             </w:r>
             <w:r>
               <w:rPr>

</xml_diff>